<commit_message>
Rebuild 2026-08-20 report from civil crew daily briefing notes
Co-Authored-By: Claude Fable 5 <noreply@anthropic.com>
Claude-Session: https://claude.ai/code/session_019UGpM3ZDPErkHojPtkGGy9
</commit_message>
<xml_diff>
--- a/reports/Titan2_Daily_Report_2026-08-20.docx
+++ b/reports/Titan2_Daily_Report_2026-08-20.docx
@@ -163,7 +163,7 @@
           <w:sz w:val="21"/>
           <w:szCs w:val="21"/>
         </w:rPr>
-        <w:t xml:space="preserve">Not recorded</w:t>
+        <w:t xml:space="preserve">Civil crews working Areas 16, 17, 18, 19, and 22; counts not recorded</w:t>
       </w:r>
     </w:p>
     <w:p>
@@ -194,7 +194,7 @@
           <w:sz w:val="21"/>
           <w:szCs w:val="21"/>
         </w:rPr>
-        <w:t xml:space="preserve">No field notes were recorded for this day — no Plaud recording was captured, so field activities, crew counts, and progress are not documented here. The open action item register is carried forward unchanged from DR-2026-08-18. Standing context for the day: tower scaffolding continuing toward the 08-23 access-complete target ahead of the 08-24 program kickoff, Legacy ventilation due in place by 08-22 with rescue plans by 08-23, Kodiak pre-commissioning underway since 08-17, and the Bidell grout, acid gas dirt work, and stabilizer torque/levelness follow-ups continuing. Any completions or field events from this day will be reflected in the next report with recorded notes.</w:t>
+        <w:t xml:space="preserve">Civil crews are moving well across the plant. In Area 18, foundations C-45150 and C-45175 are complete with forms stripped, and crews are setting forms for the last foundation pour for the dense phase pumps before relocating to Area 19 to begin forming for the two acid gas compressors. In Area 19, crews are also auguring supports for the interconnect piping. In Area 22, the V-48100 forms have been stripped and backfilling begins today. In Area 17, pedestal form stripping has begun on H-59200, and in Area 16 the V-47150 foundation and backfill are complete with the H-49200 backfill expected to finish today. Elsewhere, the tower program holds its schedule: scaffolding toward the 08-23 access-complete target, Legacy ventilation by 08-22 and rescue plans by 08-23, and the 08-24 night-shift kickoff at 16:00 CT.</w:t>
       </w:r>
     </w:p>
     <w:p>
@@ -227,10 +227,123 @@
       </w:pPr>
       <w:r>
         <w:rPr>
+          <w:b/>
+          <w:bCs/>
           <w:sz w:val="21"/>
           <w:szCs w:val="21"/>
         </w:rPr>
-        <w:t xml:space="preserve">Not recorded — no field notes were captured for this day.</w:t>
+        <w:t xml:space="preserve">Area 18: </w:t>
+      </w:r>
+      <w:r>
+        <w:rPr>
+          <w:sz w:val="21"/>
+          <w:szCs w:val="21"/>
+        </w:rPr>
+        <w:t xml:space="preserve">foundations C-45150 and C-45175 complete, forms stripped; forms being set for the last dense phase pump foundation pour.</w:t>
+      </w:r>
+    </w:p>
+    <w:p>
+      <w:pPr>
+        <w:pStyle w:val="ListParagraph"/>
+        <w:numPr>
+          <w:ilvl w:val="0"/>
+          <w:numId w:val="2"/>
+        </w:numPr>
+        <w:spacing w:after="60"/>
+      </w:pPr>
+      <w:r>
+        <w:rPr>
+          <w:b/>
+          <w:bCs/>
+          <w:sz w:val="21"/>
+          <w:szCs w:val="21"/>
+        </w:rPr>
+        <w:t xml:space="preserve">Area 19: </w:t>
+      </w:r>
+      <w:r>
+        <w:rPr>
+          <w:sz w:val="21"/>
+          <w:szCs w:val="21"/>
+        </w:rPr>
+        <w:t xml:space="preserve">crews relocating from Area 18 to begin forming the two acid gas compressor foundations; auguring supports for the interconnect piping.</w:t>
+      </w:r>
+    </w:p>
+    <w:p>
+      <w:pPr>
+        <w:pStyle w:val="ListParagraph"/>
+        <w:numPr>
+          <w:ilvl w:val="0"/>
+          <w:numId w:val="2"/>
+        </w:numPr>
+        <w:spacing w:after="60"/>
+      </w:pPr>
+      <w:r>
+        <w:rPr>
+          <w:b/>
+          <w:bCs/>
+          <w:sz w:val="21"/>
+          <w:szCs w:val="21"/>
+        </w:rPr>
+        <w:t xml:space="preserve">Area 22: </w:t>
+      </w:r>
+      <w:r>
+        <w:rPr>
+          <w:sz w:val="21"/>
+          <w:szCs w:val="21"/>
+        </w:rPr>
+        <w:t xml:space="preserve">V-48100 forms stripped; backfilling begins today.</w:t>
+      </w:r>
+    </w:p>
+    <w:p>
+      <w:pPr>
+        <w:pStyle w:val="ListParagraph"/>
+        <w:numPr>
+          <w:ilvl w:val="0"/>
+          <w:numId w:val="2"/>
+        </w:numPr>
+        <w:spacing w:after="60"/>
+      </w:pPr>
+      <w:r>
+        <w:rPr>
+          <w:b/>
+          <w:bCs/>
+          <w:sz w:val="21"/>
+          <w:szCs w:val="21"/>
+        </w:rPr>
+        <w:t xml:space="preserve">Area 17: </w:t>
+      </w:r>
+      <w:r>
+        <w:rPr>
+          <w:sz w:val="21"/>
+          <w:szCs w:val="21"/>
+        </w:rPr>
+        <w:t xml:space="preserve">pedestal form stripping begun on H-59200.</w:t>
+      </w:r>
+    </w:p>
+    <w:p>
+      <w:pPr>
+        <w:pStyle w:val="ListParagraph"/>
+        <w:numPr>
+          <w:ilvl w:val="0"/>
+          <w:numId w:val="2"/>
+        </w:numPr>
+        <w:spacing w:after="60"/>
+      </w:pPr>
+      <w:r>
+        <w:rPr>
+          <w:b/>
+          <w:bCs/>
+          <w:sz w:val="21"/>
+          <w:szCs w:val="21"/>
+        </w:rPr>
+        <w:t xml:space="preserve">Area 16: </w:t>
+      </w:r>
+      <w:r>
+        <w:rPr>
+          <w:sz w:val="21"/>
+          <w:szCs w:val="21"/>
+        </w:rPr>
+        <w:t xml:space="preserve">V-47150 foundation and backfill complete (heater area); H-49200 backfill expected complete by end of day.</w:t>
       </w:r>
     </w:p>
     <w:p>
@@ -266,7 +379,7 @@
           <w:sz w:val="21"/>
           <w:szCs w:val="21"/>
         </w:rPr>
-        <w:t xml:space="preserve">None recorded.</w:t>
+        <w:t xml:space="preserve">None performed today.</w:t>
       </w:r>
     </w:p>
     <w:p>
@@ -414,7 +527,7 @@
           <w:sz w:val="21"/>
           <w:szCs w:val="21"/>
         </w:rPr>
-        <w:t xml:space="preserve">This is a minimal report — no field notes were recorded for this day. Statuses shown in the register are carried, not verified for this date.</w:t>
+        <w:t xml:space="preserve">A second recording from this morning (07:11) is still transcribing in Plaud — anything from it will be picked up in the next report. Register statuses outside the civil scope are carried from DR-2026-08-18.</w:t>
       </w:r>
     </w:p>
     <w:p>
@@ -3431,7 +3544,7 @@
                 <w:sz w:val="19"/>
                 <w:szCs w:val="19"/>
               </w:rPr>
-              <w:t xml:space="preserve">Heater foundations — H-49200: grind remaining clips and remove foundation forms; H-59200: forms complete, ready to pour.</w:t>
+              <w:t xml:space="preserve">Heater foundations — H-49200 (Area 16): backfill expected complete 08-20; H-59200 (Area 17): pedestal form stripping begun; V-47150 foundation and backfill complete.</w:t>
             </w:r>
           </w:p>
         </w:tc>
@@ -5958,6 +6071,474 @@
                 <w:szCs w:val="19"/>
               </w:rPr>
               <w:t xml:space="preserve">Open</w:t>
+            </w:r>
+          </w:p>
+        </w:tc>
+      </w:tr>
+      <w:tr>
+        <w:tc>
+          <w:tcPr>
+            <w:tcW w:type="dxa" w:w="500"/>
+            <w:tcMar>
+              <w:top w:type="dxa" w:w="60"/>
+              <w:left w:type="dxa" w:w="100"/>
+              <w:bottom w:type="dxa" w:w="60"/>
+              <w:right w:type="dxa" w:w="100"/>
+            </w:tcMar>
+          </w:tcPr>
+          <w:p>
+            <w:r>
+              <w:rPr>
+                <w:b w:val="false"/>
+                <w:bCs w:val="false"/>
+                <w:color w:val="6E6A60"/>
+                <w:sz w:val="19"/>
+                <w:szCs w:val="19"/>
+              </w:rPr>
+              <w:t xml:space="preserve">47</w:t>
+            </w:r>
+          </w:p>
+        </w:tc>
+        <w:tc>
+          <w:tcPr>
+            <w:tcW w:type="dxa" w:w="5000"/>
+            <w:tcMar>
+              <w:top w:type="dxa" w:w="60"/>
+              <w:left w:type="dxa" w:w="100"/>
+              <w:bottom w:type="dxa" w:w="60"/>
+              <w:right w:type="dxa" w:w="100"/>
+            </w:tcMar>
+          </w:tcPr>
+          <w:p>
+            <w:r>
+              <w:rPr>
+                <w:b w:val="false"/>
+                <w:bCs w:val="false"/>
+                <w:color w:val="23211C"/>
+                <w:sz w:val="19"/>
+                <w:szCs w:val="19"/>
+              </w:rPr>
+              <w:t xml:space="preserve">Form the foundations for the two acid gas compressors in Area 19 — crews relocating from Area 18.</w:t>
+            </w:r>
+          </w:p>
+        </w:tc>
+        <w:tc>
+          <w:tcPr>
+            <w:tcW w:type="dxa" w:w="1300"/>
+            <w:tcMar>
+              <w:top w:type="dxa" w:w="60"/>
+              <w:left w:type="dxa" w:w="100"/>
+              <w:bottom w:type="dxa" w:w="60"/>
+              <w:right w:type="dxa" w:w="100"/>
+            </w:tcMar>
+          </w:tcPr>
+          <w:p>
+            <w:r>
+              <w:rPr>
+                <w:b w:val="false"/>
+                <w:bCs w:val="false"/>
+                <w:color w:val="23211C"/>
+                <w:sz w:val="19"/>
+                <w:szCs w:val="19"/>
+              </w:rPr>
+              <w:t xml:space="preserve">Acid Gas</w:t>
+            </w:r>
+          </w:p>
+        </w:tc>
+        <w:tc>
+          <w:tcPr>
+            <w:tcW w:type="dxa" w:w="1800"/>
+            <w:tcMar>
+              <w:top w:type="dxa" w:w="60"/>
+              <w:left w:type="dxa" w:w="100"/>
+              <w:bottom w:type="dxa" w:w="60"/>
+              <w:right w:type="dxa" w:w="100"/>
+            </w:tcMar>
+          </w:tcPr>
+          <w:p>
+            <w:r>
+              <w:rPr>
+                <w:b w:val="false"/>
+                <w:bCs w:val="false"/>
+                <w:color w:val="23211C"/>
+                <w:sz w:val="19"/>
+                <w:szCs w:val="19"/>
+              </w:rPr>
+              <w:t xml:space="preserve">Civil crew</w:t>
+            </w:r>
+          </w:p>
+        </w:tc>
+        <w:tc>
+          <w:tcPr>
+            <w:tcW w:type="dxa" w:w="1200"/>
+            <w:tcMar>
+              <w:top w:type="dxa" w:w="60"/>
+              <w:left w:type="dxa" w:w="100"/>
+              <w:bottom w:type="dxa" w:w="60"/>
+              <w:right w:type="dxa" w:w="100"/>
+            </w:tcMar>
+          </w:tcPr>
+          <w:p>
+            <w:r>
+              <w:rPr>
+                <w:b/>
+                <w:bCs/>
+                <w:color w:val="9A6700"/>
+                <w:sz w:val="19"/>
+                <w:szCs w:val="19"/>
+              </w:rPr>
+              <w:t xml:space="preserve">In Progress</w:t>
+            </w:r>
+          </w:p>
+        </w:tc>
+      </w:tr>
+      <w:tr>
+        <w:tc>
+          <w:tcPr>
+            <w:tcW w:type="dxa" w:w="500"/>
+            <w:tcMar>
+              <w:top w:type="dxa" w:w="60"/>
+              <w:left w:type="dxa" w:w="100"/>
+              <w:bottom w:type="dxa" w:w="60"/>
+              <w:right w:type="dxa" w:w="100"/>
+            </w:tcMar>
+          </w:tcPr>
+          <w:p>
+            <w:r>
+              <w:rPr>
+                <w:b w:val="false"/>
+                <w:bCs w:val="false"/>
+                <w:color w:val="6E6A60"/>
+                <w:sz w:val="19"/>
+                <w:szCs w:val="19"/>
+              </w:rPr>
+              <w:t xml:space="preserve">48</w:t>
+            </w:r>
+          </w:p>
+        </w:tc>
+        <w:tc>
+          <w:tcPr>
+            <w:tcW w:type="dxa" w:w="5000"/>
+            <w:tcMar>
+              <w:top w:type="dxa" w:w="60"/>
+              <w:left w:type="dxa" w:w="100"/>
+              <w:bottom w:type="dxa" w:w="60"/>
+              <w:right w:type="dxa" w:w="100"/>
+            </w:tcMar>
+          </w:tcPr>
+          <w:p>
+            <w:r>
+              <w:rPr>
+                <w:b w:val="false"/>
+                <w:bCs w:val="false"/>
+                <w:color w:val="23211C"/>
+                <w:sz w:val="19"/>
+                <w:szCs w:val="19"/>
+              </w:rPr>
+              <w:t xml:space="preserve">Set forms and pour the last foundation for the dense phase pumps (Area 18).</w:t>
+            </w:r>
+          </w:p>
+        </w:tc>
+        <w:tc>
+          <w:tcPr>
+            <w:tcW w:type="dxa" w:w="1300"/>
+            <w:tcMar>
+              <w:top w:type="dxa" w:w="60"/>
+              <w:left w:type="dxa" w:w="100"/>
+              <w:bottom w:type="dxa" w:w="60"/>
+              <w:right w:type="dxa" w:w="100"/>
+            </w:tcMar>
+          </w:tcPr>
+          <w:p>
+            <w:r>
+              <w:rPr>
+                <w:b w:val="false"/>
+                <w:bCs w:val="false"/>
+                <w:color w:val="23211C"/>
+                <w:sz w:val="19"/>
+                <w:szCs w:val="19"/>
+              </w:rPr>
+              <w:t xml:space="preserve">Civil</w:t>
+            </w:r>
+          </w:p>
+        </w:tc>
+        <w:tc>
+          <w:tcPr>
+            <w:tcW w:type="dxa" w:w="1800"/>
+            <w:tcMar>
+              <w:top w:type="dxa" w:w="60"/>
+              <w:left w:type="dxa" w:w="100"/>
+              <w:bottom w:type="dxa" w:w="60"/>
+              <w:right w:type="dxa" w:w="100"/>
+            </w:tcMar>
+          </w:tcPr>
+          <w:p>
+            <w:r>
+              <w:rPr>
+                <w:b w:val="false"/>
+                <w:bCs w:val="false"/>
+                <w:color w:val="23211C"/>
+                <w:sz w:val="19"/>
+                <w:szCs w:val="19"/>
+              </w:rPr>
+              <w:t xml:space="preserve">Civil crew</w:t>
+            </w:r>
+          </w:p>
+        </w:tc>
+        <w:tc>
+          <w:tcPr>
+            <w:tcW w:type="dxa" w:w="1200"/>
+            <w:tcMar>
+              <w:top w:type="dxa" w:w="60"/>
+              <w:left w:type="dxa" w:w="100"/>
+              <w:bottom w:type="dxa" w:w="60"/>
+              <w:right w:type="dxa" w:w="100"/>
+            </w:tcMar>
+          </w:tcPr>
+          <w:p>
+            <w:r>
+              <w:rPr>
+                <w:b/>
+                <w:bCs/>
+                <w:color w:val="9A6700"/>
+                <w:sz w:val="19"/>
+                <w:szCs w:val="19"/>
+              </w:rPr>
+              <w:t xml:space="preserve">In Progress</w:t>
+            </w:r>
+          </w:p>
+        </w:tc>
+      </w:tr>
+      <w:tr>
+        <w:tc>
+          <w:tcPr>
+            <w:tcW w:type="dxa" w:w="500"/>
+            <w:tcMar>
+              <w:top w:type="dxa" w:w="60"/>
+              <w:left w:type="dxa" w:w="100"/>
+              <w:bottom w:type="dxa" w:w="60"/>
+              <w:right w:type="dxa" w:w="100"/>
+            </w:tcMar>
+          </w:tcPr>
+          <w:p>
+            <w:r>
+              <w:rPr>
+                <w:b w:val="false"/>
+                <w:bCs w:val="false"/>
+                <w:color w:val="6E6A60"/>
+                <w:sz w:val="19"/>
+                <w:szCs w:val="19"/>
+              </w:rPr>
+              <w:t xml:space="preserve">49</w:t>
+            </w:r>
+          </w:p>
+        </w:tc>
+        <w:tc>
+          <w:tcPr>
+            <w:tcW w:type="dxa" w:w="5000"/>
+            <w:tcMar>
+              <w:top w:type="dxa" w:w="60"/>
+              <w:left w:type="dxa" w:w="100"/>
+              <w:bottom w:type="dxa" w:w="60"/>
+              <w:right w:type="dxa" w:w="100"/>
+            </w:tcMar>
+          </w:tcPr>
+          <w:p>
+            <w:r>
+              <w:rPr>
+                <w:b w:val="false"/>
+                <w:bCs w:val="false"/>
+                <w:color w:val="23211C"/>
+                <w:sz w:val="19"/>
+                <w:szCs w:val="19"/>
+              </w:rPr>
+              <w:t xml:space="preserve">Backfill V-48100 (Area 22) — forms stripped, backfill starting 08-20.</w:t>
+            </w:r>
+          </w:p>
+        </w:tc>
+        <w:tc>
+          <w:tcPr>
+            <w:tcW w:type="dxa" w:w="1300"/>
+            <w:tcMar>
+              <w:top w:type="dxa" w:w="60"/>
+              <w:left w:type="dxa" w:w="100"/>
+              <w:bottom w:type="dxa" w:w="60"/>
+              <w:right w:type="dxa" w:w="100"/>
+            </w:tcMar>
+          </w:tcPr>
+          <w:p>
+            <w:r>
+              <w:rPr>
+                <w:b w:val="false"/>
+                <w:bCs w:val="false"/>
+                <w:color w:val="23211C"/>
+                <w:sz w:val="19"/>
+                <w:szCs w:val="19"/>
+              </w:rPr>
+              <w:t xml:space="preserve">Civil</w:t>
+            </w:r>
+          </w:p>
+        </w:tc>
+        <w:tc>
+          <w:tcPr>
+            <w:tcW w:type="dxa" w:w="1800"/>
+            <w:tcMar>
+              <w:top w:type="dxa" w:w="60"/>
+              <w:left w:type="dxa" w:w="100"/>
+              <w:bottom w:type="dxa" w:w="60"/>
+              <w:right w:type="dxa" w:w="100"/>
+            </w:tcMar>
+          </w:tcPr>
+          <w:p>
+            <w:r>
+              <w:rPr>
+                <w:b w:val="false"/>
+                <w:bCs w:val="false"/>
+                <w:color w:val="23211C"/>
+                <w:sz w:val="19"/>
+                <w:szCs w:val="19"/>
+              </w:rPr>
+              <w:t xml:space="preserve">Civil crew</w:t>
+            </w:r>
+          </w:p>
+        </w:tc>
+        <w:tc>
+          <w:tcPr>
+            <w:tcW w:type="dxa" w:w="1200"/>
+            <w:tcMar>
+              <w:top w:type="dxa" w:w="60"/>
+              <w:left w:type="dxa" w:w="100"/>
+              <w:bottom w:type="dxa" w:w="60"/>
+              <w:right w:type="dxa" w:w="100"/>
+            </w:tcMar>
+          </w:tcPr>
+          <w:p>
+            <w:r>
+              <w:rPr>
+                <w:b/>
+                <w:bCs/>
+                <w:color w:val="9A6700"/>
+                <w:sz w:val="19"/>
+                <w:szCs w:val="19"/>
+              </w:rPr>
+              <w:t xml:space="preserve">In Progress</w:t>
+            </w:r>
+          </w:p>
+        </w:tc>
+      </w:tr>
+      <w:tr>
+        <w:tc>
+          <w:tcPr>
+            <w:tcW w:type="dxa" w:w="500"/>
+            <w:tcMar>
+              <w:top w:type="dxa" w:w="60"/>
+              <w:left w:type="dxa" w:w="100"/>
+              <w:bottom w:type="dxa" w:w="60"/>
+              <w:right w:type="dxa" w:w="100"/>
+            </w:tcMar>
+          </w:tcPr>
+          <w:p>
+            <w:r>
+              <w:rPr>
+                <w:b w:val="false"/>
+                <w:bCs w:val="false"/>
+                <w:color w:val="6E6A60"/>
+                <w:sz w:val="19"/>
+                <w:szCs w:val="19"/>
+              </w:rPr>
+              <w:t xml:space="preserve">50</w:t>
+            </w:r>
+          </w:p>
+        </w:tc>
+        <w:tc>
+          <w:tcPr>
+            <w:tcW w:type="dxa" w:w="5000"/>
+            <w:tcMar>
+              <w:top w:type="dxa" w:w="60"/>
+              <w:left w:type="dxa" w:w="100"/>
+              <w:bottom w:type="dxa" w:w="60"/>
+              <w:right w:type="dxa" w:w="100"/>
+            </w:tcMar>
+          </w:tcPr>
+          <w:p>
+            <w:r>
+              <w:rPr>
+                <w:b w:val="false"/>
+                <w:bCs w:val="false"/>
+                <w:color w:val="23211C"/>
+                <w:sz w:val="19"/>
+                <w:szCs w:val="19"/>
+              </w:rPr>
+              <w:t xml:space="preserve">Continue auguring supports for the interconnect piping in Area 19.</w:t>
+            </w:r>
+          </w:p>
+        </w:tc>
+        <w:tc>
+          <w:tcPr>
+            <w:tcW w:type="dxa" w:w="1300"/>
+            <w:tcMar>
+              <w:top w:type="dxa" w:w="60"/>
+              <w:left w:type="dxa" w:w="100"/>
+              <w:bottom w:type="dxa" w:w="60"/>
+              <w:right w:type="dxa" w:w="100"/>
+            </w:tcMar>
+          </w:tcPr>
+          <w:p>
+            <w:r>
+              <w:rPr>
+                <w:b w:val="false"/>
+                <w:bCs w:val="false"/>
+                <w:color w:val="23211C"/>
+                <w:sz w:val="19"/>
+                <w:szCs w:val="19"/>
+              </w:rPr>
+              <w:t xml:space="preserve">Piping</w:t>
+            </w:r>
+          </w:p>
+        </w:tc>
+        <w:tc>
+          <w:tcPr>
+            <w:tcW w:type="dxa" w:w="1800"/>
+            <w:tcMar>
+              <w:top w:type="dxa" w:w="60"/>
+              <w:left w:type="dxa" w:w="100"/>
+              <w:bottom w:type="dxa" w:w="60"/>
+              <w:right w:type="dxa" w:w="100"/>
+            </w:tcMar>
+          </w:tcPr>
+          <w:p>
+            <w:r>
+              <w:rPr>
+                <w:b w:val="false"/>
+                <w:bCs w:val="false"/>
+                <w:color w:val="23211C"/>
+                <w:sz w:val="19"/>
+                <w:szCs w:val="19"/>
+              </w:rPr>
+              <w:t xml:space="preserve">Civil crew</w:t>
+            </w:r>
+          </w:p>
+        </w:tc>
+        <w:tc>
+          <w:tcPr>
+            <w:tcW w:type="dxa" w:w="1200"/>
+            <w:tcMar>
+              <w:top w:type="dxa" w:w="60"/>
+              <w:left w:type="dxa" w:w="100"/>
+              <w:bottom w:type="dxa" w:w="60"/>
+              <w:right w:type="dxa" w:w="100"/>
+            </w:tcMar>
+          </w:tcPr>
+          <w:p>
+            <w:r>
+              <w:rPr>
+                <w:b/>
+                <w:bCs/>
+                <w:color w:val="9A6700"/>
+                <w:sz w:val="19"/>
+                <w:szCs w:val="19"/>
+              </w:rPr>
+              <w:t xml:space="preserve">In Progress</w:t>
             </w:r>
           </w:p>
         </w:tc>
@@ -5996,7 +6577,7 @@
           <w:sz w:val="21"/>
           <w:szCs w:val="21"/>
         </w:rPr>
-        <w:t xml:space="preserve">Continue tower scaffolding toward the 08-23 access-complete target.</w:t>
+        <w:t xml:space="preserve">Continue forming the acid gas compressor foundations in Area 19; pour the last dense phase pump foundation in Area 18.</w:t>
       </w:r>
     </w:p>
     <w:p>
@@ -6013,7 +6594,41 @@
           <w:sz w:val="21"/>
           <w:szCs w:val="21"/>
         </w:rPr>
-        <w:t xml:space="preserve">Chase the cool gaskets order and the manway cover quote due to Manny 08-21.</w:t>
+        <w:t xml:space="preserve">Continue V-48100 backfill (Area 22) and the interconnect piping support augers (Area 19).</w:t>
+      </w:r>
+    </w:p>
+    <w:p>
+      <w:pPr>
+        <w:pStyle w:val="ListParagraph"/>
+        <w:numPr>
+          <w:ilvl w:val="0"/>
+          <w:numId w:val="2"/>
+        </w:numPr>
+        <w:spacing w:after="60"/>
+      </w:pPr>
+      <w:r>
+        <w:rPr>
+          <w:sz w:val="21"/>
+          <w:szCs w:val="21"/>
+        </w:rPr>
+        <w:t xml:space="preserve">Continue tower scaffolding toward the 08-23 access-complete target; rescue rigging window opens 08-21 if scaffolding finishes early.</w:t>
+      </w:r>
+    </w:p>
+    <w:p>
+      <w:pPr>
+        <w:pStyle w:val="ListParagraph"/>
+        <w:numPr>
+          <w:ilvl w:val="0"/>
+          <w:numId w:val="2"/>
+        </w:numPr>
+        <w:spacing w:after="60"/>
+      </w:pPr>
+      <w:r>
+        <w:rPr>
+          <w:sz w:val="21"/>
+          <w:szCs w:val="21"/>
+        </w:rPr>
+        <w:t xml:space="preserve">Manway cover quote due to Manny; chase the cool gaskets order.</w:t>
       </w:r>
     </w:p>
     <w:p>
@@ -6035,23 +6650,6 @@
     </w:p>
     <w:p>
       <w:pPr>
-        <w:pStyle w:val="ListParagraph"/>
-        <w:numPr>
-          <w:ilvl w:val="0"/>
-          <w:numId w:val="2"/>
-        </w:numPr>
-        <w:spacing w:after="60"/>
-      </w:pPr>
-      <w:r>
-        <w:rPr>
-          <w:sz w:val="21"/>
-          <w:szCs w:val="21"/>
-        </w:rPr>
-        <w:t xml:space="preserve">Continue Bidell grout re-prep, acid gas dirt work, and the stabilizer torque/levelness follow-ups.</w:t>
-      </w:r>
-    </w:p>
-    <w:p>
-      <w:pPr>
         <w:pBdr>
           <w:top w:val="single" w:color="DED9CE" w:sz="6"/>
         </w:pBdr>
@@ -6063,7 +6661,7 @@
           <w:sz w:val="18"/>
           <w:szCs w:val="18"/>
         </w:rPr>
-        <w:t xml:space="preserve">Minimal report issued for the record: no Plaud recording or field notes exist for this day. The open action item register (1-46) is carried forward unchanged from DR-2026-08-18; statuses are as last recorded, not verified for this date.</w:t>
+        <w:t xml:space="preserve">Compiled from the 08-20 Plaud daily briefing (civil crew progress and foundation work). The 07:11 morning recording had not finished transcribing at issue time. Register items 1-46 carried from DR-2026-08-18 with item 25 updated; new civil items are 47-50. This report supersedes the earlier minimal DR-2026-08-20 issued before the day's notes were available.</w:t>
       </w:r>
     </w:p>
     <w:sectPr>

</xml_diff>